<commit_message>
eda and plotting week 4
</commit_message>
<xml_diff>
--- a/docs/20260827 Course guide Social Networks.docx
+++ b/docs/20260827 Course guide Social Networks.docx
@@ -1,6 +1,6 @@
 
 <file path=word/document.xml><?xml version="1.0" encoding="utf-8"?>
-<w:document xmlns:wpc="http://schemas.microsoft.com/office/word/2010/wordprocessingCanvas" xmlns:cx="http://schemas.microsoft.com/office/drawing/2014/chartex" xmlns:cx1="http://schemas.microsoft.com/office/drawing/2015/9/8/chartex" xmlns:cx2="http://schemas.microsoft.com/office/drawing/2015/10/21/chartex" xmlns:cx3="http://schemas.microsoft.com/office/drawing/2016/5/9/chartex" xmlns:cx4="http://schemas.microsoft.com/office/drawing/2016/5/10/chartex" xmlns:cx5="http://schemas.microsoft.com/office/drawing/2016/5/11/chartex" xmlns:cx6="http://schemas.microsoft.com/office/drawing/2016/5/12/chartex" xmlns:cx7="http://schemas.microsoft.com/office/drawing/2016/5/13/chartex" xmlns:cx8="http://schemas.microsoft.com/office/drawing/2016/5/14/chartex" xmlns:mc="http://schemas.openxmlformats.org/markup-compatibility/2006" xmlns:aink="http://schemas.microsoft.com/office/drawing/2016/ink" xmlns:am3d="http://schemas.microsoft.com/office/drawing/2017/model3d" xmlns:o="urn:schemas-microsoft-com:office:office" xmlns:oel="http://schemas.microsoft.com/office/2019/extlst" xmlns:r="http://schemas.openxmlformats.org/officeDocument/2006/relationships" xmlns:m="http://schemas.openxmlformats.org/officeDocument/2006/math" xmlns:v="urn:schemas-microsoft-com:vml" xmlns:wp14="http://schemas.microsoft.com/office/word/2010/wordprocessingDrawing" xmlns:wp="http://schemas.openxmlformats.org/drawingml/2006/wordprocessingDrawing" xmlns:w10="urn:schemas-microsoft-com:office:word" xmlns:w="http://schemas.openxmlformats.org/wordprocessingml/2006/main" xmlns:w14="http://schemas.microsoft.com/office/word/2010/wordml" xmlns:w15="http://schemas.microsoft.com/office/word/2012/wordml" xmlns:w16cei="http://schemas.microsoft.com/office/word/2026/wordml/cei" xmlns:w16cex="http://schemas.microsoft.com/office/word/2018/wordml/cex" xmlns:w16cid="http://schemas.microsoft.com/office/word/2016/wordml/cid" xmlns:w16="http://schemas.microsoft.com/office/word/2018/wordml" xmlns:w16du="http://schemas.microsoft.com/office/word/2023/wordml/word16du" xmlns:w16sdtdh="http://schemas.microsoft.com/office/word/2020/wordml/sdtdatahash" xmlns:w16sdtfl="http://schemas.microsoft.com/office/word/2024/wordml/sdtformatlock" xmlns:w16se="http://schemas.microsoft.com/office/word/2015/wordml/symex" xmlns:wpg="http://schemas.microsoft.com/office/word/2010/wordprocessingGroup" xmlns:wpi="http://schemas.microsoft.com/office/word/2010/wordprocessingInk" xmlns:wne="http://schemas.microsoft.com/office/word/2006/wordml" xmlns:wps="http://schemas.microsoft.com/office/word/2010/wordprocessingShape" mc:Ignorable="w14 w15 w16se w16cid w16 w16cex w16sdtdh w16sdtfl w16du wp14">
+<w:document xmlns:wpc="http://schemas.microsoft.com/office/word/2010/wordprocessingCanvas" xmlns:cx="http://schemas.microsoft.com/office/drawing/2014/chartex" xmlns:cx1="http://schemas.microsoft.com/office/drawing/2015/9/8/chartex" xmlns:cx2="http://schemas.microsoft.com/office/drawing/2015/10/21/chartex" xmlns:cx3="http://schemas.microsoft.com/office/drawing/2016/5/9/chartex" xmlns:cx4="http://schemas.microsoft.com/office/drawing/2016/5/10/chartex" xmlns:cx5="http://schemas.microsoft.com/office/drawing/2016/5/11/chartex" xmlns:cx6="http://schemas.microsoft.com/office/drawing/2016/5/12/chartex" xmlns:cx7="http://schemas.microsoft.com/office/drawing/2016/5/13/chartex" xmlns:cx8="http://schemas.microsoft.com/office/drawing/2016/5/14/chartex" xmlns:mc="http://schemas.openxmlformats.org/markup-compatibility/2006" xmlns:aink="http://schemas.microsoft.com/office/drawing/2016/ink" xmlns:am3d="http://schemas.microsoft.com/office/drawing/2017/model3d" xmlns:o="urn:schemas-microsoft-com:office:office" xmlns:oel="http://schemas.microsoft.com/office/2019/extlst" xmlns:r="http://schemas.openxmlformats.org/officeDocument/2006/relationships" xmlns:m="http://schemas.openxmlformats.org/officeDocument/2006/math" xmlns:v="urn:schemas-microsoft-com:vml" xmlns:wp14="http://schemas.microsoft.com/office/word/2010/wordprocessingDrawing" xmlns:wp="http://schemas.openxmlformats.org/drawingml/2006/wordprocessingDrawing" xmlns:w10="urn:schemas-microsoft-com:office:word" xmlns:w="http://schemas.openxmlformats.org/wordprocessingml/2006/main" xmlns:w14="http://schemas.microsoft.com/office/word/2010/wordml" xmlns:w15="http://schemas.microsoft.com/office/word/2012/wordml" xmlns:w16cex="http://schemas.microsoft.com/office/word/2018/wordml/cex" xmlns:w16cid="http://schemas.microsoft.com/office/word/2016/wordml/cid" xmlns:w16="http://schemas.microsoft.com/office/word/2018/wordml" xmlns:w16du="http://schemas.microsoft.com/office/word/2023/wordml/word16du" xmlns:w16sdtdh="http://schemas.microsoft.com/office/word/2020/wordml/sdtdatahash" xmlns:w16sdtfl="http://schemas.microsoft.com/office/word/2024/wordml/sdtformatlock" xmlns:w16se="http://schemas.microsoft.com/office/word/2015/wordml/symex" xmlns:wpg="http://schemas.microsoft.com/office/word/2010/wordprocessingGroup" xmlns:wpi="http://schemas.microsoft.com/office/word/2010/wordprocessingInk" xmlns:wne="http://schemas.microsoft.com/office/word/2006/wordml" xmlns:wps="http://schemas.microsoft.com/office/word/2010/wordprocessingShape" mc:Ignorable="w14 w15 w16se w16cid w16 w16cex w16sdtdh w16sdtfl w16du wp14">
   <w:body>
     <w:p>
       <w:pPr>
@@ -2337,23 +2337,7 @@
             <w:rFonts w:ascii="Verdana" w:hAnsi="Verdana"/>
             <w:lang w:val="en-US"/>
           </w:rPr>
-          <w:t>Labj</w:t>
-        </w:r>
-        <w:r>
-          <w:rPr>
-            <w:rStyle w:val="Hyperlink"/>
-            <w:rFonts w:ascii="Verdana" w:hAnsi="Verdana"/>
-            <w:lang w:val="en-US"/>
-          </w:rPr>
-          <w:t>o</w:t>
-        </w:r>
-        <w:r>
-          <w:rPr>
-            <w:rStyle w:val="Hyperlink"/>
-            <w:rFonts w:ascii="Verdana" w:hAnsi="Verdana"/>
-            <w:lang w:val="en-US"/>
-          </w:rPr>
-          <w:t>urnal</w:t>
+          <w:t>Labjournal</w:t>
         </w:r>
         <w:proofErr w:type="spellEnd"/>
       </w:hyperlink>
@@ -3176,31 +3160,21 @@
           <w:lang w:val="en-US"/>
         </w:rPr>
       </w:pPr>
-      <w:r>
+    </w:p>
+    <w:p>
+      <w:pPr>
         <w:rPr>
           <w:rFonts w:ascii="Verdana" w:hAnsi="Verdana"/>
           <w:color w:val="FF0000"/>
           <w:lang w:val="en-US"/>
         </w:rPr>
-        <w:lastRenderedPageBreak/>
-        <w:br w:type="page"/>
-      </w:r>
-    </w:p>
-    <w:p>
-      <w:pPr>
+      </w:pPr>
+      <w:r>
         <w:rPr>
           <w:rFonts w:ascii="Verdana" w:hAnsi="Verdana"/>
           <w:color w:val="FF0000"/>
           <w:lang w:val="en-US"/>
         </w:rPr>
-      </w:pPr>
-      <w:r>
-        <w:rPr>
-          <w:rFonts w:ascii="Verdana" w:hAnsi="Verdana"/>
-          <w:color w:val="FF0000"/>
-          <w:lang w:val="en-US"/>
-        </w:rPr>
-        <w:lastRenderedPageBreak/>
         <w:t>21</w:t>
       </w:r>
       <w:r>
@@ -3296,6 +3270,159 @@
         </w:rPr>
         <w:t>9</w:t>
       </w:r>
+      <w:r>
+        <w:rPr>
+          <w:rFonts w:ascii="Verdana" w:hAnsi="Verdana"/>
+          <w:lang w:val="en-US"/>
+        </w:rPr>
+        <w:t xml:space="preserve"> (in de les)</w:t>
+      </w:r>
+    </w:p>
+    <w:p>
+      <w:pPr>
+        <w:pStyle w:val="ListParagraph"/>
+        <w:numPr>
+          <w:ilvl w:val="1"/>
+          <w:numId w:val="14"/>
+        </w:numPr>
+        <w:spacing w:after="160" w:line="259" w:lineRule="auto"/>
+        <w:rPr>
+          <w:rFonts w:ascii="Verdana" w:hAnsi="Verdana"/>
+          <w:b/>
+          <w:lang w:val="en-US"/>
+        </w:rPr>
+      </w:pPr>
+      <w:r>
+        <w:rPr>
+          <w:rFonts w:ascii="Verdana" w:hAnsi="Verdana"/>
+          <w:lang w:val="en-US"/>
+        </w:rPr>
+        <w:t xml:space="preserve">Manual </w:t>
+      </w:r>
+      <w:proofErr w:type="spellStart"/>
+      <w:r>
+        <w:rPr>
+          <w:rFonts w:ascii="Verdana" w:hAnsi="Verdana"/>
+          <w:lang w:val="en-US"/>
+        </w:rPr>
+        <w:t>RSiena</w:t>
+      </w:r>
+      <w:proofErr w:type="spellEnd"/>
+      <w:r>
+        <w:rPr>
+          <w:rFonts w:ascii="Verdana" w:hAnsi="Verdana"/>
+          <w:lang w:val="en-US"/>
+        </w:rPr>
+        <w:t xml:space="preserve"> </w:t>
+      </w:r>
+      <w:proofErr w:type="spellStart"/>
+      <w:r>
+        <w:rPr>
+          <w:rFonts w:ascii="Verdana" w:hAnsi="Verdana"/>
+          <w:lang w:val="en-US"/>
+        </w:rPr>
+        <w:t>doorlezen</w:t>
+      </w:r>
+      <w:proofErr w:type="spellEnd"/>
+      <w:r>
+        <w:rPr>
+          <w:rFonts w:ascii="Verdana" w:hAnsi="Verdana"/>
+          <w:lang w:val="en-US"/>
+        </w:rPr>
+        <w:t xml:space="preserve"> (</w:t>
+      </w:r>
+      <w:hyperlink r:id="rId31" w:history="1">
+        <w:r>
+          <w:rPr>
+            <w:rStyle w:val="Hyperlink"/>
+            <w:rFonts w:ascii="Verdana" w:hAnsi="Verdana"/>
+            <w:lang w:val="en-US"/>
+          </w:rPr>
+          <w:t>https://www.stats.ox.ac.uk/~snijders/siena/RSiena_Manual.pdf</w:t>
+        </w:r>
+      </w:hyperlink>
+      <w:r>
+        <w:rPr>
+          <w:rFonts w:ascii="Verdana" w:hAnsi="Verdana"/>
+          <w:lang w:val="en-US"/>
+        </w:rPr>
+        <w:t xml:space="preserve">) </w:t>
+      </w:r>
+    </w:p>
+    <w:p>
+      <w:pPr>
+        <w:pStyle w:val="ListParagraph"/>
+        <w:numPr>
+          <w:ilvl w:val="1"/>
+          <w:numId w:val="14"/>
+        </w:numPr>
+        <w:spacing w:after="160" w:line="259" w:lineRule="auto"/>
+        <w:rPr>
+          <w:rFonts w:ascii="Verdana" w:hAnsi="Verdana"/>
+          <w:b/>
+        </w:rPr>
+      </w:pPr>
+      <w:r>
+        <w:rPr>
+          <w:rFonts w:ascii="Verdana" w:hAnsi="Verdana"/>
+        </w:rPr>
+        <w:t xml:space="preserve">Doorwerken van de workshop </w:t>
+      </w:r>
+      <w:r>
+        <w:rPr>
+          <w:rFonts w:ascii="Verdana" w:hAnsi="Verdana"/>
+        </w:rPr>
+        <w:t>(</w:t>
+      </w:r>
+      <w:hyperlink r:id="rId32" w:history="1">
+        <w:r>
+          <w:rPr>
+            <w:rStyle w:val="Hyperlink"/>
+            <w:rFonts w:ascii="Verdana" w:hAnsi="Verdana"/>
+          </w:rPr>
+          <w:t>https://jochemtolsma.github.io/RSiena_tutorial/60RSiena.html#67_Step_7_(optional):_Relative_Influence</w:t>
+        </w:r>
+      </w:hyperlink>
+      <w:r>
+        <w:rPr>
+          <w:rFonts w:ascii="Verdana" w:hAnsi="Verdana"/>
+        </w:rPr>
+        <w:t xml:space="preserve">) </w:t>
+      </w:r>
+    </w:p>
+    <w:p>
+      <w:pPr>
+        <w:pStyle w:val="ListParagraph"/>
+        <w:numPr>
+          <w:ilvl w:val="1"/>
+          <w:numId w:val="14"/>
+        </w:numPr>
+        <w:spacing w:after="160" w:line="259" w:lineRule="auto"/>
+        <w:rPr>
+          <w:rFonts w:ascii="Verdana" w:hAnsi="Verdana"/>
+          <w:b/>
+        </w:rPr>
+      </w:pPr>
+      <w:r>
+        <w:rPr>
+          <w:rFonts w:ascii="Verdana" w:hAnsi="Verdana"/>
+        </w:rPr>
+        <w:t xml:space="preserve">Lab </w:t>
+      </w:r>
+      <w:proofErr w:type="spellStart"/>
+      <w:r>
+        <w:rPr>
+          <w:rFonts w:ascii="Verdana" w:hAnsi="Verdana"/>
+        </w:rPr>
+        <w:t>journal</w:t>
+      </w:r>
+      <w:proofErr w:type="spellEnd"/>
+      <w:r>
+        <w:rPr>
+          <w:rFonts w:ascii="Verdana" w:hAnsi="Verdana"/>
+        </w:rPr>
+        <w:t xml:space="preserve"> bijwerken</w:t>
+      </w:r>
     </w:p>
     <w:p>
       <w:pPr>
@@ -3819,7 +3946,7 @@
         </w:rPr>
         <w:t xml:space="preserve">See also: </w:t>
       </w:r>
-      <w:hyperlink r:id="rId31" w:history="1">
+      <w:hyperlink r:id="rId33" w:history="1">
         <w:r>
           <w:rPr>
             <w:rStyle w:val="Hyperlink"/>
@@ -3869,7 +3996,7 @@
         </w:rPr>
         <w:t xml:space="preserve"> manual: </w:t>
       </w:r>
-      <w:hyperlink r:id="rId32" w:history="1">
+      <w:hyperlink r:id="rId34" w:history="1">
         <w:r>
           <w:rPr>
             <w:rStyle w:val="Hyperlink"/>
@@ -3995,7 +4122,7 @@
         </w:rPr>
         <w:t xml:space="preserve">For dataset, see here: </w:t>
       </w:r>
-      <w:hyperlink r:id="rId33" w:anchor="22_input_data" w:history="1">
+      <w:hyperlink r:id="rId35" w:anchor="22_input_data" w:history="1">
         <w:r>
           <w:rPr>
             <w:rStyle w:val="Hyperlink"/>
@@ -5060,7 +5187,7 @@
         </w:rPr>
         <w:t xml:space="preserve">Course handbook: </w:t>
       </w:r>
-      <w:hyperlink r:id="rId34" w:history="1">
+      <w:hyperlink r:id="rId36" w:history="1">
         <w:r>
           <w:rPr>
             <w:rStyle w:val="Hyperlink"/>
@@ -5084,7 +5211,7 @@
           <w:lang w:val="en-GB" w:eastAsia="en-GB"/>
         </w:rPr>
       </w:pPr>
-      <w:hyperlink r:id="rId35" w:history="1">
+      <w:hyperlink r:id="rId37" w:history="1">
         <w:proofErr w:type="spellStart"/>
         <w:r>
           <w:rPr>
@@ -5221,7 +5348,7 @@
           <w:lang w:val="en-GB"/>
         </w:rPr>
       </w:pPr>
-      <w:hyperlink r:id="rId36" w:history="1">
+      <w:hyperlink r:id="rId38" w:history="1">
         <w:r>
           <w:rPr>
             <w:rStyle w:val="Hyperlink"/>
@@ -5302,7 +5429,7 @@
         </w:rPr>
         <w:t xml:space="preserve">(1), 34-62. </w:t>
       </w:r>
-      <w:hyperlink r:id="rId37" w:history="1">
+      <w:hyperlink r:id="rId39" w:history="1">
         <w:r>
           <w:rPr>
             <w:rStyle w:val="Hyperlink"/>
@@ -5398,7 +5525,7 @@
           <w:lang w:val="en-US"/>
         </w:rPr>
       </w:pPr>
-      <w:hyperlink r:id="rId38" w:history="1">
+      <w:hyperlink r:id="rId40" w:history="1">
         <w:r>
           <w:rPr>
             <w:rStyle w:val="Hyperlink"/>
@@ -5503,7 +5630,7 @@
           <w:lang w:val="en-GB"/>
         </w:rPr>
       </w:pPr>
-      <w:hyperlink r:id="rId39" w:history="1">
+      <w:hyperlink r:id="rId41" w:history="1">
         <w:r>
           <w:rPr>
             <w:rStyle w:val="Hyperlink"/>
@@ -5785,7 +5912,7 @@
 </file>
 
 <file path=word/numbering.xml><?xml version="1.0" encoding="utf-8"?>
-<w:numbering xmlns:wpc="http://schemas.microsoft.com/office/word/2010/wordprocessingCanvas" xmlns:cx="http://schemas.microsoft.com/office/drawing/2014/chartex" xmlns:cx1="http://schemas.microsoft.com/office/drawing/2015/9/8/chartex" xmlns:cx2="http://schemas.microsoft.com/office/drawing/2015/10/21/chartex" xmlns:cx3="http://schemas.microsoft.com/office/drawing/2016/5/9/chartex" xmlns:cx4="http://schemas.microsoft.com/office/drawing/2016/5/10/chartex" xmlns:cx5="http://schemas.microsoft.com/office/drawing/2016/5/11/chartex" xmlns:cx6="http://schemas.microsoft.com/office/drawing/2016/5/12/chartex" xmlns:cx7="http://schemas.microsoft.com/office/drawing/2016/5/13/chartex" xmlns:cx8="http://schemas.microsoft.com/office/drawing/2016/5/14/chartex" xmlns:mc="http://schemas.openxmlformats.org/markup-compatibility/2006" xmlns:aink="http://schemas.microsoft.com/office/drawing/2016/ink" xmlns:am3d="http://schemas.microsoft.com/office/drawing/2017/model3d" xmlns:o="urn:schemas-microsoft-com:office:office" xmlns:oel="http://schemas.microsoft.com/office/2019/extlst" xmlns:r="http://schemas.openxmlformats.org/officeDocument/2006/relationships" xmlns:m="http://schemas.openxmlformats.org/officeDocument/2006/math" xmlns:v="urn:schemas-microsoft-com:vml" xmlns:wp14="http://schemas.microsoft.com/office/word/2010/wordprocessingDrawing" xmlns:wp="http://schemas.openxmlformats.org/drawingml/2006/wordprocessingDrawing" xmlns:w10="urn:schemas-microsoft-com:office:word" xmlns:w="http://schemas.openxmlformats.org/wordprocessingml/2006/main" xmlns:w14="http://schemas.microsoft.com/office/word/2010/wordml" xmlns:w15="http://schemas.microsoft.com/office/word/2012/wordml" xmlns:w16cei="http://schemas.microsoft.com/office/word/2026/wordml/cei" xmlns:w16cex="http://schemas.microsoft.com/office/word/2018/wordml/cex" xmlns:w16cid="http://schemas.microsoft.com/office/word/2016/wordml/cid" xmlns:w16="http://schemas.microsoft.com/office/word/2018/wordml" xmlns:w16du="http://schemas.microsoft.com/office/word/2023/wordml/word16du" xmlns:w16sdtdh="http://schemas.microsoft.com/office/word/2020/wordml/sdtdatahash" xmlns:w16sdtfl="http://schemas.microsoft.com/office/word/2024/wordml/sdtformatlock" xmlns:w16se="http://schemas.microsoft.com/office/word/2015/wordml/symex" xmlns:wpg="http://schemas.microsoft.com/office/word/2010/wordprocessingGroup" xmlns:wpi="http://schemas.microsoft.com/office/word/2010/wordprocessingInk" xmlns:wne="http://schemas.microsoft.com/office/word/2006/wordml" xmlns:wps="http://schemas.microsoft.com/office/word/2010/wordprocessingShape" mc:Ignorable="w14 w15 w16se w16cid w16 w16cex w16sdtdh w16sdtfl w16du wp14">
+<w:numbering xmlns:wpc="http://schemas.microsoft.com/office/word/2010/wordprocessingCanvas" xmlns:cx="http://schemas.microsoft.com/office/drawing/2014/chartex" xmlns:cx1="http://schemas.microsoft.com/office/drawing/2015/9/8/chartex" xmlns:cx2="http://schemas.microsoft.com/office/drawing/2015/10/21/chartex" xmlns:cx3="http://schemas.microsoft.com/office/drawing/2016/5/9/chartex" xmlns:cx4="http://schemas.microsoft.com/office/drawing/2016/5/10/chartex" xmlns:cx5="http://schemas.microsoft.com/office/drawing/2016/5/11/chartex" xmlns:cx6="http://schemas.microsoft.com/office/drawing/2016/5/12/chartex" xmlns:cx7="http://schemas.microsoft.com/office/drawing/2016/5/13/chartex" xmlns:cx8="http://schemas.microsoft.com/office/drawing/2016/5/14/chartex" xmlns:mc="http://schemas.openxmlformats.org/markup-compatibility/2006" xmlns:aink="http://schemas.microsoft.com/office/drawing/2016/ink" xmlns:am3d="http://schemas.microsoft.com/office/drawing/2017/model3d" xmlns:o="urn:schemas-microsoft-com:office:office" xmlns:oel="http://schemas.microsoft.com/office/2019/extlst" xmlns:r="http://schemas.openxmlformats.org/officeDocument/2006/relationships" xmlns:m="http://schemas.openxmlformats.org/officeDocument/2006/math" xmlns:v="urn:schemas-microsoft-com:vml" xmlns:wp14="http://schemas.microsoft.com/office/word/2010/wordprocessingDrawing" xmlns:wp="http://schemas.openxmlformats.org/drawingml/2006/wordprocessingDrawing" xmlns:w10="urn:schemas-microsoft-com:office:word" xmlns:w="http://schemas.openxmlformats.org/wordprocessingml/2006/main" xmlns:w14="http://schemas.microsoft.com/office/word/2010/wordml" xmlns:w15="http://schemas.microsoft.com/office/word/2012/wordml" xmlns:w16cex="http://schemas.microsoft.com/office/word/2018/wordml/cex" xmlns:w16cid="http://schemas.microsoft.com/office/word/2016/wordml/cid" xmlns:w16="http://schemas.microsoft.com/office/word/2018/wordml" xmlns:w16du="http://schemas.microsoft.com/office/word/2023/wordml/word16du" xmlns:w16sdtdh="http://schemas.microsoft.com/office/word/2020/wordml/sdtdatahash" xmlns:w16sdtfl="http://schemas.microsoft.com/office/word/2024/wordml/sdtformatlock" xmlns:w16se="http://schemas.microsoft.com/office/word/2015/wordml/symex" xmlns:wpg="http://schemas.microsoft.com/office/word/2010/wordprocessingGroup" xmlns:wpi="http://schemas.microsoft.com/office/word/2010/wordprocessingInk" xmlns:wne="http://schemas.microsoft.com/office/word/2006/wordml" xmlns:wps="http://schemas.microsoft.com/office/word/2010/wordprocessingShape" mc:Ignorable="w14 w15 w16se w16cid w16 w16cex w16sdtdh w16sdtfl w16du wp14">
   <w:abstractNum w:abstractNumId="0" w15:restartNumberingAfterBreak="0">
     <w:nsid w:val="00ED3EEA"/>
     <w:multiLevelType w:val="hybridMultilevel"/>
@@ -9405,20 +9532,20 @@
 </file>
 
 <file path=customXml/item2.xml><?xml version="1.0" encoding="utf-8"?>
-<p:properties xmlns:p="http://schemas.microsoft.com/office/2006/metadata/properties" xmlns:xsi="http://www.w3.org/2001/XMLSchema-instance" xmlns:pc="http://schemas.microsoft.com/office/infopath/2007/PartnerControls">
-  <documentManagement>
-    <_activity xmlns="085fb5cd-16b3-4e7e-8f65-6131b327270a" xsi:nil="true"/>
-  </documentManagement>
-</p:properties>
-</file>
-
-<file path=customXml/item3.xml><?xml version="1.0" encoding="utf-8"?>
 <?mso-contentType ?>
 <FormTemplates xmlns="http://schemas.microsoft.com/sharepoint/v3/contenttype/forms">
   <Display>DocumentLibraryForm</Display>
   <Edit>DocumentLibraryForm</Edit>
   <New>DocumentLibraryForm</New>
 </FormTemplates>
+</file>
+
+<file path=customXml/item3.xml><?xml version="1.0" encoding="utf-8"?>
+<p:properties xmlns:p="http://schemas.microsoft.com/office/2006/metadata/properties" xmlns:xsi="http://www.w3.org/2001/XMLSchema-instance" xmlns:pc="http://schemas.microsoft.com/office/infopath/2007/PartnerControls">
+  <documentManagement>
+    <_activity xmlns="085fb5cd-16b3-4e7e-8f65-6131b327270a" xsi:nil="true"/>
+  </documentManagement>
+</p:properties>
 </file>
 
 <file path=customXml/itemProps1.xml><?xml version="1.0" encoding="utf-8"?>
@@ -9441,6 +9568,14 @@
 </file>
 
 <file path=customXml/itemProps2.xml><?xml version="1.0" encoding="utf-8"?>
+<ds:datastoreItem xmlns:ds="http://schemas.openxmlformats.org/officeDocument/2006/customXml" ds:itemID="{4DB5F1B8-FFF8-4263-AF35-570CB9FB7B30}">
+  <ds:schemaRefs>
+    <ds:schemaRef ds:uri="http://schemas.microsoft.com/sharepoint/v3/contenttype/forms"/>
+  </ds:schemaRefs>
+</ds:datastoreItem>
+</file>
+
+<file path=customXml/itemProps3.xml><?xml version="1.0" encoding="utf-8"?>
 <ds:datastoreItem xmlns:ds="http://schemas.openxmlformats.org/officeDocument/2006/customXml" ds:itemID="{421F70D6-3A7A-4F27-8B8B-74B51A50E52A}">
   <ds:schemaRefs>
     <ds:schemaRef ds:uri="http://schemas.microsoft.com/office/2006/metadata/properties"/>
@@ -9450,14 +9585,6 @@
 </ds:datastoreItem>
 </file>
 
-<file path=customXml/itemProps3.xml><?xml version="1.0" encoding="utf-8"?>
-<ds:datastoreItem xmlns:ds="http://schemas.openxmlformats.org/officeDocument/2006/customXml" ds:itemID="{4DB5F1B8-FFF8-4263-AF35-570CB9FB7B30}">
-  <ds:schemaRefs>
-    <ds:schemaRef ds:uri="http://schemas.microsoft.com/sharepoint/v3/contenttype/forms"/>
-  </ds:schemaRefs>
-</ds:datastoreItem>
-</file>
-
 <file path=docMetadata/LabelInfo.xml><?xml version="1.0" encoding="utf-8"?>
 <clbl:labelList xmlns:clbl="http://schemas.microsoft.com/office/2020/mipLabelMetadata">
   <clbl:label id="{084578d9-400d-4a5a-a7c7-e76ca47af400}" enabled="0" method="" siteId="{084578d9-400d-4a5a-a7c7-e76ca47af400}" removed="1"/>

</xml_diff>